<commit_message>
Restructure SentinelLite project and update documentation
</commit_message>
<xml_diff>
--- a/03_Practical_Implementation_Project/SentinelLite/docs/SentinelLite_Architecture_and_Data_Specification.docx
+++ b/03_Practical_Implementation_Project/SentinelLite/docs/SentinelLite_Architecture_and_Data_Specification.docx
@@ -220,8 +220,8 @@
         <w:tblLook w:val="04A0" w:firstRow="1" w:lastRow="0" w:firstColumn="1" w:lastColumn="0" w:noHBand="0" w:noVBand="1"/>
       </w:tblPr>
       <w:tblGrid>
-        <w:gridCol w:w="4896"/>
-        <w:gridCol w:w="4896"/>
+        <w:gridCol w:w="4888"/>
+        <w:gridCol w:w="4894"/>
       </w:tblGrid>
       <w:tr>
         <w:trPr>
@@ -611,7 +611,15 @@
     </w:p>
     <w:p>
       <w:r>
-        <w:t>This document defines the proposed component architecture, synthetic CSV data contract, initial detection scenarios, and severity design for SentinelLite. It translates the approved Project Proposal and SRS into a design that can be implemented and tested. It is a design document only; no application code is included.</w:t>
+        <w:t xml:space="preserve">This document defines the proposed component architecture, synthetic CSV data contract, initial detection scenarios, and severity design for </w:t>
+      </w:r>
+      <w:proofErr w:type="spellStart"/>
+      <w:r>
+        <w:t>SentinelLite</w:t>
+      </w:r>
+      <w:proofErr w:type="spellEnd"/>
+      <w:r>
+        <w:t>. It translates the approved Project Proposal and SRS into a design that can be implemented and tested. It is a design document only; no application code is included.</w:t>
       </w:r>
     </w:p>
     <w:p>
@@ -619,7 +627,31 @@
         <w:pStyle w:val="ListBullet"/>
       </w:pPr>
       <w:r>
-        <w:t>Local-first: core analysis runs on the user's computer without paid services or external APIs.</w:t>
+        <w:t xml:space="preserve">Web-based architecture: the frontend uses Next.js, TypeScript, Tailwind CSS, and </w:t>
+      </w:r>
+      <w:proofErr w:type="spellStart"/>
+      <w:r>
+        <w:t>shadcn</w:t>
+      </w:r>
+      <w:proofErr w:type="spellEnd"/>
+      <w:r>
+        <w:t>/</w:t>
+      </w:r>
+      <w:proofErr w:type="spellStart"/>
+      <w:r>
+        <w:t>ui</w:t>
+      </w:r>
+      <w:proofErr w:type="spellEnd"/>
+      <w:r>
+        <w:t xml:space="preserve">; the backend uses Python and </w:t>
+      </w:r>
+      <w:proofErr w:type="spellStart"/>
+      <w:r>
+        <w:t>FastAPI</w:t>
+      </w:r>
+      <w:proofErr w:type="spellEnd"/>
+      <w:r>
+        <w:t>.</w:t>
       </w:r>
     </w:p>
     <w:p>
@@ -627,7 +659,7 @@
         <w:pStyle w:val="ListBullet"/>
       </w:pPr>
       <w:r>
-        <w:t>Synthetic-data-only: the initial release uses artificial sample records.</w:t>
+        <w:t>Synthetic-data-first: the bundled sample dataset uses artificial records; users should not upload confidential or sensitive logs to the public demo.</w:t>
       </w:r>
     </w:p>
     <w:p>
@@ -692,10 +724,10 @@
         <w:tblLook w:val="04A0" w:firstRow="1" w:lastRow="0" w:firstColumn="1" w:lastColumn="0" w:noHBand="0" w:noVBand="1"/>
       </w:tblPr>
       <w:tblGrid>
-        <w:gridCol w:w="2448"/>
-        <w:gridCol w:w="2448"/>
-        <w:gridCol w:w="2448"/>
-        <w:gridCol w:w="2448"/>
+        <w:gridCol w:w="2443"/>
+        <w:gridCol w:w="2444"/>
+        <w:gridCol w:w="2445"/>
+        <w:gridCol w:w="2444"/>
       </w:tblGrid>
       <w:tr>
         <w:trPr>
@@ -875,7 +907,7 @@
               <w:rPr>
                 <w:sz w:val="18"/>
               </w:rPr>
-              <w:t>User selects the bundled or supported synthetic CSV file.</w:t>
+              <w:t>User uploads a supported synthetic CSV file through the web frontend.</w:t>
             </w:r>
           </w:p>
         </w:tc>
@@ -1286,7 +1318,7 @@
               <w:rPr>
                 <w:sz w:val="18"/>
               </w:rPr>
-              <w:t>Interactive local view</w:t>
+              <w:t>Web dashboard results returned by the API</w:t>
             </w:r>
           </w:p>
         </w:tc>
@@ -1405,9 +1437,9 @@
         <w:tblLook w:val="04A0" w:firstRow="1" w:lastRow="0" w:firstColumn="1" w:lastColumn="0" w:noHBand="0" w:noVBand="1"/>
       </w:tblPr>
       <w:tblGrid>
-        <w:gridCol w:w="3264"/>
-        <w:gridCol w:w="3264"/>
-        <w:gridCol w:w="3264"/>
+        <w:gridCol w:w="3258"/>
+        <w:gridCol w:w="3261"/>
+        <w:gridCol w:w="3257"/>
       </w:tblGrid>
       <w:tr>
         <w:trPr>
@@ -1538,7 +1570,21 @@
               <w:rPr>
                 <w:sz w:val="18"/>
               </w:rPr>
-              <w:t>src/app.py</w:t>
+              <w:t>frontend/</w:t>
+            </w:r>
+            <w:proofErr w:type="spellStart"/>
+            <w:r>
+              <w:rPr>
+                <w:sz w:val="18"/>
+              </w:rPr>
+              <w:t>src</w:t>
+            </w:r>
+            <w:proofErr w:type="spellEnd"/>
+            <w:r>
+              <w:rPr>
+                <w:sz w:val="18"/>
+              </w:rPr>
+              <w:t>/app/</w:t>
             </w:r>
           </w:p>
         </w:tc>
@@ -1561,7 +1607,7 @@
               <w:rPr>
                 <w:sz w:val="18"/>
               </w:rPr>
-              <w:t>Streamlit page layout, file selection, metrics, filters, and export controls.</w:t>
+              <w:t>Next.js page layout, file selection, metrics, filters, and export controls.</w:t>
             </w:r>
           </w:p>
         </w:tc>
@@ -1612,7 +1658,7 @@
               <w:rPr>
                 <w:sz w:val="18"/>
               </w:rPr>
-              <w:t>src/log_parser.py</w:t>
+              <w:t>backend/app/log_parser.py</w:t>
             </w:r>
           </w:p>
         </w:tc>
@@ -1686,7 +1732,7 @@
               <w:rPr>
                 <w:sz w:val="18"/>
               </w:rPr>
-              <w:t>src/detector.py</w:t>
+              <w:t>backend/app/detector.py</w:t>
             </w:r>
           </w:p>
         </w:tc>
@@ -1760,7 +1806,7 @@
               <w:rPr>
                 <w:sz w:val="18"/>
               </w:rPr>
-              <w:t>src/risk_scorer.py</w:t>
+              <w:t>backend/app/risk_scorer.py</w:t>
             </w:r>
           </w:p>
         </w:tc>
@@ -1908,7 +1954,7 @@
               <w:rPr>
                 <w:sz w:val="18"/>
               </w:rPr>
-              <w:t>tests/</w:t>
+              <w:t>backend/tests/</w:t>
             </w:r>
           </w:p>
         </w:tc>
@@ -1931,7 +1977,14 @@
               <w:rPr>
                 <w:sz w:val="18"/>
               </w:rPr>
-              <w:t>Verify parser, detection, severity, and supported export behavior.</w:t>
+              <w:t xml:space="preserve">Verify parser, detection, severity, and </w:t>
+            </w:r>
+            <w:r>
+              <w:rPr>
+                <w:sz w:val="18"/>
+              </w:rPr>
+              <w:lastRenderedPageBreak/>
+              <w:t>supported export behavior.</w:t>
             </w:r>
           </w:p>
         </w:tc>
@@ -1959,6 +2012,7 @@
               <w:rPr>
                 <w:sz w:val="18"/>
               </w:rPr>
+              <w:lastRenderedPageBreak/>
               <w:t>Documentation</w:t>
             </w:r>
           </w:p>
@@ -2057,7 +2111,7 @@
         <w:pStyle w:val="ListBullet"/>
       </w:pPr>
       <w:r>
-        <w:t>The initial application has no database, authentication service, background agent, or cloud dependency.</w:t>
+        <w:t>The initial application has no database, mandatory user accounts, persistent analysis history, or background agent. Local development and testing precede public deployment, which is the final milestone.</w:t>
       </w:r>
     </w:p>
     <w:p>
@@ -2084,7 +2138,7 @@
     </w:p>
     <w:p>
       <w:r>
-        <w:t>The following schema is the proposed initial contract. Confirm it during review before implementation. One CSV row represents one event.</w:t>
+        <w:t>The following schema is the proposed initial contract. Keep the field names and types consistent with the separate Data Specification document before implementation. One CSV row represents one event.</w:t>
       </w:r>
     </w:p>
     <w:tbl>
@@ -2095,10 +2149,10 @@
         <w:tblLook w:val="04A0" w:firstRow="1" w:lastRow="0" w:firstColumn="1" w:lastColumn="0" w:noHBand="0" w:noVBand="1"/>
       </w:tblPr>
       <w:tblGrid>
-        <w:gridCol w:w="2448"/>
-        <w:gridCol w:w="2448"/>
-        <w:gridCol w:w="2448"/>
-        <w:gridCol w:w="2448"/>
+        <w:gridCol w:w="2443"/>
+        <w:gridCol w:w="2443"/>
+        <w:gridCol w:w="2443"/>
+        <w:gridCol w:w="2447"/>
       </w:tblGrid>
       <w:tr>
         <w:trPr>
@@ -2228,12 +2282,14 @@
             <w:pPr>
               <w:spacing w:after="40"/>
             </w:pPr>
+            <w:proofErr w:type="spellStart"/>
             <w:r>
               <w:rPr>
                 <w:sz w:val="18"/>
               </w:rPr>
               <w:t>event_id</w:t>
             </w:r>
+            <w:proofErr w:type="spellEnd"/>
           </w:p>
         </w:tc>
         <w:tc>
@@ -2422,12 +2478,14 @@
             <w:pPr>
               <w:spacing w:after="40"/>
             </w:pPr>
+            <w:proofErr w:type="spellStart"/>
             <w:r>
               <w:rPr>
                 <w:sz w:val="18"/>
               </w:rPr>
               <w:t>event_type</w:t>
             </w:r>
+            <w:proofErr w:type="spellEnd"/>
           </w:p>
         </w:tc>
         <w:tc>
@@ -2449,8 +2507,16 @@
               <w:rPr>
                 <w:sz w:val="18"/>
               </w:rPr>
-              <w:t>String / enum</w:t>
-            </w:r>
+              <w:t xml:space="preserve">String / </w:t>
+            </w:r>
+            <w:proofErr w:type="spellStart"/>
+            <w:r>
+              <w:rPr>
+                <w:sz w:val="18"/>
+              </w:rPr>
+              <w:t>enum</w:t>
+            </w:r>
+            <w:proofErr w:type="spellEnd"/>
           </w:p>
         </w:tc>
         <w:tc>
@@ -2495,7 +2561,49 @@
               <w:rPr>
                 <w:sz w:val="18"/>
               </w:rPr>
-              <w:t>Category such as login, privilege_change, process_alert, or network_connection.</w:t>
+              <w:t xml:space="preserve">Category such as login, </w:t>
+            </w:r>
+            <w:proofErr w:type="spellStart"/>
+            <w:r>
+              <w:rPr>
+                <w:sz w:val="18"/>
+              </w:rPr>
+              <w:t>privilege_change</w:t>
+            </w:r>
+            <w:proofErr w:type="spellEnd"/>
+            <w:r>
+              <w:rPr>
+                <w:sz w:val="18"/>
+              </w:rPr>
+              <w:t xml:space="preserve">, </w:t>
+            </w:r>
+            <w:proofErr w:type="spellStart"/>
+            <w:r>
+              <w:rPr>
+                <w:sz w:val="18"/>
+              </w:rPr>
+              <w:t>process_alert</w:t>
+            </w:r>
+            <w:proofErr w:type="spellEnd"/>
+            <w:r>
+              <w:rPr>
+                <w:sz w:val="18"/>
+              </w:rPr>
+              <w:t xml:space="preserve">, or </w:t>
+            </w:r>
+            <w:proofErr w:type="spellStart"/>
+            <w:r>
+              <w:rPr>
+                <w:sz w:val="18"/>
+              </w:rPr>
+              <w:t>network_connection</w:t>
+            </w:r>
+            <w:proofErr w:type="spellEnd"/>
+            <w:r>
+              <w:rPr>
+                <w:sz w:val="18"/>
+              </w:rPr>
+              <w:t>.</w:t>
             </w:r>
           </w:p>
         </w:tc>
@@ -2713,12 +2821,14 @@
             <w:pPr>
               <w:spacing w:after="40"/>
             </w:pPr>
+            <w:proofErr w:type="spellStart"/>
             <w:r>
               <w:rPr>
                 <w:sz w:val="18"/>
               </w:rPr>
               <w:t>source_ip</w:t>
             </w:r>
+            <w:proofErr w:type="spellEnd"/>
           </w:p>
         </w:tc>
         <w:tc>
@@ -2837,8 +2947,16 @@
               <w:rPr>
                 <w:sz w:val="18"/>
               </w:rPr>
-              <w:t>String / enum</w:t>
-            </w:r>
+              <w:t xml:space="preserve">String / </w:t>
+            </w:r>
+            <w:proofErr w:type="spellStart"/>
+            <w:r>
+              <w:rPr>
+                <w:sz w:val="18"/>
+              </w:rPr>
+              <w:t>enum</w:t>
+            </w:r>
+            <w:proofErr w:type="spellEnd"/>
           </w:p>
         </w:tc>
         <w:tc>
@@ -2883,7 +3001,21 @@
               <w:rPr>
                 <w:sz w:val="18"/>
               </w:rPr>
-              <w:t>Activity such as login, privilege_change, or connection.</w:t>
+              <w:t xml:space="preserve">Activity such as login, </w:t>
+            </w:r>
+            <w:proofErr w:type="spellStart"/>
+            <w:r>
+              <w:rPr>
+                <w:sz w:val="18"/>
+              </w:rPr>
+              <w:t>privilege_change</w:t>
+            </w:r>
+            <w:proofErr w:type="spellEnd"/>
+            <w:r>
+              <w:rPr>
+                <w:sz w:val="18"/>
+              </w:rPr>
+              <w:t>, or connection.</w:t>
             </w:r>
           </w:p>
         </w:tc>
@@ -2934,8 +3066,16 @@
               <w:rPr>
                 <w:sz w:val="18"/>
               </w:rPr>
-              <w:t>String / enum</w:t>
-            </w:r>
+              <w:t xml:space="preserve">String / </w:t>
+            </w:r>
+            <w:proofErr w:type="spellStart"/>
+            <w:r>
+              <w:rPr>
+                <w:sz w:val="18"/>
+              </w:rPr>
+              <w:t>enum</w:t>
+            </w:r>
+            <w:proofErr w:type="spellEnd"/>
           </w:p>
         </w:tc>
         <w:tc>
@@ -3083,12 +3223,27 @@
         </w:tc>
       </w:tr>
     </w:tbl>
-    <w:p/>
+    <w:p>
+      <w:pPr>
+        <w:pStyle w:val="Heading2"/>
+      </w:pPr>
+    </w:p>
+    <w:p>
+      <w:pPr>
+        <w:spacing w:after="0"/>
+      </w:pPr>
+    </w:p>
+    <w:p>
+      <w:pPr>
+        <w:spacing w:after="0"/>
+      </w:pPr>
+    </w:p>
     <w:p>
       <w:pPr>
         <w:pStyle w:val="Heading2"/>
       </w:pPr>
       <w:r>
+        <w:lastRenderedPageBreak/>
         <w:t>3.2 Allowed Values and Normalization</w:t>
       </w:r>
     </w:p>
@@ -3100,8 +3255,8 @@
         <w:tblLook w:val="04A0" w:firstRow="1" w:lastRow="0" w:firstColumn="1" w:lastColumn="0" w:noHBand="0" w:noVBand="1"/>
       </w:tblPr>
       <w:tblGrid>
-        <w:gridCol w:w="4896"/>
-        <w:gridCol w:w="4896"/>
+        <w:gridCol w:w="4888"/>
+        <w:gridCol w:w="4888"/>
       </w:tblGrid>
       <w:tr>
         <w:trPr>
@@ -3179,12 +3334,14 @@
             <w:pPr>
               <w:spacing w:after="40"/>
             </w:pPr>
+            <w:proofErr w:type="spellStart"/>
             <w:r>
               <w:rPr>
                 <w:sz w:val="18"/>
               </w:rPr>
               <w:t>event_id</w:t>
             </w:r>
+            <w:proofErr w:type="spellEnd"/>
           </w:p>
         </w:tc>
         <w:tc>
@@ -3281,12 +3438,14 @@
             <w:pPr>
               <w:spacing w:after="40"/>
             </w:pPr>
+            <w:proofErr w:type="spellStart"/>
             <w:r>
               <w:rPr>
                 <w:sz w:val="18"/>
               </w:rPr>
               <w:t>event_type</w:t>
             </w:r>
+            <w:proofErr w:type="spellEnd"/>
           </w:p>
         </w:tc>
         <w:tc>
@@ -3410,14 +3569,35 @@
               <w:rPr>
                 <w:sz w:val="18"/>
               </w:rPr>
-              <w:t xml:space="preserve">Use artificial labels such as user_demo or service_test; avoid </w:t>
-            </w:r>
-            <w:r>
-              <w:rPr>
-                <w:sz w:val="18"/>
-              </w:rPr>
-              <w:lastRenderedPageBreak/>
-              <w:t>real identities.</w:t>
+              <w:t xml:space="preserve">Use artificial labels such as </w:t>
+            </w:r>
+            <w:proofErr w:type="spellStart"/>
+            <w:r>
+              <w:rPr>
+                <w:sz w:val="18"/>
+              </w:rPr>
+              <w:t>user_demo</w:t>
+            </w:r>
+            <w:proofErr w:type="spellEnd"/>
+            <w:r>
+              <w:rPr>
+                <w:sz w:val="18"/>
+              </w:rPr>
+              <w:t xml:space="preserve"> or </w:t>
+            </w:r>
+            <w:proofErr w:type="spellStart"/>
+            <w:r>
+              <w:rPr>
+                <w:sz w:val="18"/>
+              </w:rPr>
+              <w:t>service_test</w:t>
+            </w:r>
+            <w:proofErr w:type="spellEnd"/>
+            <w:r>
+              <w:rPr>
+                <w:sz w:val="18"/>
+              </w:rPr>
+              <w:t>; avoid real identities.</w:t>
             </w:r>
           </w:p>
         </w:tc>
@@ -3441,13 +3621,14 @@
             <w:pPr>
               <w:spacing w:after="40"/>
             </w:pPr>
-            <w:r>
-              <w:rPr>
-                <w:sz w:val="18"/>
-              </w:rPr>
-              <w:lastRenderedPageBreak/>
+            <w:proofErr w:type="spellStart"/>
+            <w:r>
+              <w:rPr>
+                <w:sz w:val="18"/>
+              </w:rPr>
               <w:t>source_ip</w:t>
             </w:r>
+            <w:proofErr w:type="spellEnd"/>
           </w:p>
         </w:tc>
         <w:tc>
@@ -3639,7 +3820,7 @@
     </w:p>
     <w:p>
       <w:r>
-        <w:t>Recommended behavior: reject a file when required columns are missing; for a file with the correct schema but individual malformed rows, skip invalid rows, display the number skipped and concise reasons, and continue only if at least one valid row remains. This policy needs user approval before coding.</w:t>
+        <w:t>Required behavior: reject a file when it is empty, structurally invalid, or missing required columns. If the file structure is valid but individual rows contain invalid values, skip those rows, report row numbers and concise reasons, and continue analysis if at least one valid row remains.</w:t>
       </w:r>
     </w:p>
     <w:tbl>
@@ -3650,9 +3831,9 @@
         <w:tblLook w:val="04A0" w:firstRow="1" w:lastRow="0" w:firstColumn="1" w:lastColumn="0" w:noHBand="0" w:noVBand="1"/>
       </w:tblPr>
       <w:tblGrid>
-        <w:gridCol w:w="3264"/>
-        <w:gridCol w:w="3264"/>
-        <w:gridCol w:w="3264"/>
+        <w:gridCol w:w="3259"/>
+        <w:gridCol w:w="3258"/>
+        <w:gridCol w:w="3259"/>
       </w:tblGrid>
       <w:tr>
         <w:trPr>
@@ -3857,7 +4038,7 @@
               <w:rPr>
                 <w:sz w:val="18"/>
               </w:rPr>
-              <w:t>Show an empty-data message; do not fabricate metrics.</w:t>
+              <w:t>Reject the file with a clear empty-input message; do not fabricate metrics.</w:t>
             </w:r>
           </w:p>
         </w:tc>
@@ -3931,7 +4112,7 @@
               <w:rPr>
                 <w:sz w:val="18"/>
               </w:rPr>
-              <w:t>Skip that row and report row number/reason.</w:t>
+              <w:t>Skip the row and report its row number and reason; continue with valid rows.</w:t>
             </w:r>
           </w:p>
         </w:tc>
@@ -4136,10 +4317,10 @@
         <w:tblLook w:val="04A0" w:firstRow="1" w:lastRow="0" w:firstColumn="1" w:lastColumn="0" w:noHBand="0" w:noVBand="1"/>
       </w:tblPr>
       <w:tblGrid>
+        <w:gridCol w:w="2442"/>
+        <w:gridCol w:w="2443"/>
         <w:gridCol w:w="2448"/>
-        <w:gridCol w:w="2448"/>
-        <w:gridCol w:w="2448"/>
-        <w:gridCol w:w="2448"/>
+        <w:gridCol w:w="2443"/>
       </w:tblGrid>
       <w:tr>
         <w:trPr>
@@ -4513,7 +4694,56 @@
               <w:rPr>
                 <w:sz w:val="18"/>
               </w:rPr>
-              <w:t>An event has event_type=privilege_change and actor is not in the documented synthetic allowlist.</w:t>
+              <w:t xml:space="preserve">An event has </w:t>
+            </w:r>
+            <w:proofErr w:type="spellStart"/>
+            <w:r>
+              <w:rPr>
+                <w:sz w:val="18"/>
+              </w:rPr>
+              <w:t>event_type</w:t>
+            </w:r>
+            <w:proofErr w:type="spellEnd"/>
+            <w:r>
+              <w:rPr>
+                <w:sz w:val="18"/>
+              </w:rPr>
+              <w:t>=</w:t>
+            </w:r>
+            <w:proofErr w:type="spellStart"/>
+            <w:r>
+              <w:rPr>
+                <w:sz w:val="18"/>
+              </w:rPr>
+              <w:t>privilege_change</w:t>
+            </w:r>
+            <w:proofErr w:type="spellEnd"/>
+            <w:r>
+              <w:rPr>
+                <w:sz w:val="18"/>
+              </w:rPr>
+              <w:t xml:space="preserve"> </w:t>
+            </w:r>
+            <w:r>
+              <w:rPr>
+                <w:sz w:val="18"/>
+              </w:rPr>
+              <w:lastRenderedPageBreak/>
+              <w:t xml:space="preserve">and actor </w:t>
+            </w:r>
+            <w:proofErr w:type="gramStart"/>
+            <w:r>
+              <w:rPr>
+                <w:sz w:val="18"/>
+              </w:rPr>
+              <w:t>is</w:t>
+            </w:r>
+            <w:proofErr w:type="gramEnd"/>
+            <w:r>
+              <w:rPr>
+                <w:sz w:val="18"/>
+              </w:rPr>
+              <w:t xml:space="preserve"> not in the documented synthetic allowlist.</w:t>
             </w:r>
           </w:p>
         </w:tc>
@@ -4536,6 +4766,7 @@
               <w:rPr>
                 <w:sz w:val="18"/>
               </w:rPr>
+              <w:lastRenderedPageBreak/>
               <w:t>Privilege change by an actor outside the test allowlist.</w:t>
             </w:r>
           </w:p>
@@ -4587,7 +4818,7 @@
               <w:rPr>
                 <w:sz w:val="18"/>
               </w:rPr>
-              <w:t>Test indicator match</w:t>
+              <w:t>Deferred test-indicator rule</w:t>
             </w:r>
           </w:p>
         </w:tc>
@@ -4610,7 +4841,7 @@
               <w:rPr>
                 <w:sz w:val="18"/>
               </w:rPr>
-              <w:t>A record's documented synthetic indicator field or details token matches a test-only indicator in the rule configuration.</w:t>
+              <w:t>Not implemented in MVP; do not evaluate this rule in the initial release.</w:t>
             </w:r>
           </w:p>
         </w:tc>
@@ -4633,7 +4864,7 @@
               <w:rPr>
                 <w:sz w:val="18"/>
               </w:rPr>
-              <w:t>Record matched a synthetic test indicator.</w:t>
+              <w:t>Deferred to a later version; no DET-04 alert is generated in MVP.</w:t>
             </w:r>
           </w:p>
         </w:tc>
@@ -4645,7 +4876,6 @@
         <w:pStyle w:val="Heading2"/>
       </w:pPr>
       <w:r>
-        <w:lastRenderedPageBreak/>
         <w:t>4.1 Rule Evaluation Principles</w:t>
       </w:r>
     </w:p>
@@ -4716,9 +4946,9 @@
         <w:tblLook w:val="04A0" w:firstRow="1" w:lastRow="0" w:firstColumn="1" w:lastColumn="0" w:noHBand="0" w:noVBand="1"/>
       </w:tblPr>
       <w:tblGrid>
-        <w:gridCol w:w="3264"/>
-        <w:gridCol w:w="3264"/>
-        <w:gridCol w:w="3264"/>
+        <w:gridCol w:w="3258"/>
+        <w:gridCol w:w="3259"/>
+        <w:gridCol w:w="3259"/>
       </w:tblGrid>
       <w:tr>
         <w:trPr>
@@ -4849,7 +5079,7 @@
               <w:rPr>
                 <w:sz w:val="18"/>
               </w:rPr>
-              <w:t>DET-02 successful login after repeated failures, or a confirmed match to a specifically designated high-risk synthetic rule.</w:t>
+              <w:t>DET-02: successful login after the repeated-failure condition.</w:t>
             </w:r>
           </w:p>
         </w:tc>
@@ -4872,7 +5102,7 @@
               <w:rPr>
                 <w:sz w:val="18"/>
               </w:rPr>
-              <w:t>Synthetic login sequence matching DET-02.</w:t>
+              <w:t>Same actor has at least five failures in the preceding 10 minutes and then succeeds within the defined 10-minute window.</w:t>
             </w:r>
           </w:p>
         </w:tc>
@@ -4923,7 +5153,7 @@
               <w:rPr>
                 <w:sz w:val="18"/>
               </w:rPr>
-              <w:t>DET-01 repeated failed logins or DET-03 suspicious privilege change without an additional high-risk condition.</w:t>
+              <w:t>DET-01 or DET-03, unless DET-02 also matches; High takes precedence.</w:t>
             </w:r>
           </w:p>
         </w:tc>
@@ -4946,7 +5176,7 @@
               <w:rPr>
                 <w:sz w:val="18"/>
               </w:rPr>
-              <w:t>Five or more failed logins in the documented time window.</w:t>
+              <w:t>Repeated failures or a privilege change by an actor outside the synthetic allowlist.</w:t>
             </w:r>
           </w:p>
         </w:tc>
@@ -4997,7 +5227,7 @@
               <w:rPr>
                 <w:sz w:val="18"/>
               </w:rPr>
-              <w:t>A match to a low-risk informational rule, if one is included; otherwise no alert should be generated merely to fill this category.</w:t>
+              <w:t>Reserved for a future informational rule; no Low-severity alert is generated by the MVP rules.</w:t>
             </w:r>
           </w:p>
         </w:tc>
@@ -5020,7 +5250,7 @@
               <w:rPr>
                 <w:sz w:val="18"/>
               </w:rPr>
-              <w:t>A documented low-risk test rule, if approved.</w:t>
+              <w:t>No alert is created solely to populate the Low category.</w:t>
             </w:r>
           </w:p>
         </w:tc>
@@ -5054,8 +5284,8 @@
         <w:tblLook w:val="04A0" w:firstRow="1" w:lastRow="0" w:firstColumn="1" w:lastColumn="0" w:noHBand="0" w:noVBand="1"/>
       </w:tblPr>
       <w:tblGrid>
-        <w:gridCol w:w="4896"/>
-        <w:gridCol w:w="4896"/>
+        <w:gridCol w:w="4888"/>
+        <w:gridCol w:w="4888"/>
       </w:tblGrid>
       <w:tr>
         <w:trPr>
@@ -5133,12 +5363,14 @@
             <w:pPr>
               <w:spacing w:after="40"/>
             </w:pPr>
+            <w:proofErr w:type="spellStart"/>
             <w:r>
               <w:rPr>
                 <w:sz w:val="18"/>
               </w:rPr>
               <w:t>alert_id</w:t>
             </w:r>
+            <w:proofErr w:type="spellEnd"/>
           </w:p>
         </w:tc>
         <w:tc>
@@ -5184,11 +5416,19 @@
             <w:pPr>
               <w:spacing w:after="40"/>
             </w:pPr>
-            <w:r>
-              <w:rPr>
-                <w:sz w:val="18"/>
-              </w:rPr>
-              <w:t>event_id(s)</w:t>
+            <w:proofErr w:type="spellStart"/>
+            <w:r>
+              <w:rPr>
+                <w:sz w:val="18"/>
+              </w:rPr>
+              <w:t>event_id</w:t>
+            </w:r>
+            <w:proofErr w:type="spellEnd"/>
+            <w:r>
+              <w:rPr>
+                <w:sz w:val="18"/>
+              </w:rPr>
+              <w:t>(s)</w:t>
             </w:r>
           </w:p>
         </w:tc>
@@ -5235,12 +5475,14 @@
             <w:pPr>
               <w:spacing w:after="40"/>
             </w:pPr>
+            <w:proofErr w:type="spellStart"/>
             <w:r>
               <w:rPr>
                 <w:sz w:val="18"/>
               </w:rPr>
               <w:t>rule_id</w:t>
             </w:r>
+            <w:proofErr w:type="spellEnd"/>
           </w:p>
         </w:tc>
         <w:tc>
@@ -5526,12 +5768,29 @@
     <w:p/>
     <w:p>
       <w:r>
-        <w:t>Export filenames should be descriptive, for example `sentinellite_alerts_YYYYMMDD_HHMMSS.csv` and `.json`. Export should not include unrelated raw events unless explicitly selected as a separately documented feature.</w:t>
+        <w:lastRenderedPageBreak/>
+        <w:t xml:space="preserve">Export filenames should be descriptive, for example `sentinellite_alerts_YYYYMMDD_HHMMSS.csv` and </w:t>
+      </w:r>
+      <w:proofErr w:type="gramStart"/>
+      <w:r>
+        <w:t>`.</w:t>
+      </w:r>
+      <w:proofErr w:type="spellStart"/>
+      <w:r>
+        <w:t>json</w:t>
+      </w:r>
+      <w:proofErr w:type="spellEnd"/>
+      <w:proofErr w:type="gramEnd"/>
+      <w:r>
+        <w:t>`. Export should not include unrelated raw events unless explicitly selected as a separately documented feature.</w:t>
       </w:r>
     </w:p>
     <w:p>
       <w:pPr>
         <w:pStyle w:val="Heading1"/>
+        <w:rPr>
+          <w:rFonts w:ascii="Times New Roman" w:hAnsi="Times New Roman" w:cs="Times New Roman"/>
+        </w:rPr>
       </w:pPr>
     </w:p>
     <w:p>
@@ -5556,8 +5815,8 @@
         <w:tblLook w:val="04A0" w:firstRow="1" w:lastRow="0" w:firstColumn="1" w:lastColumn="0" w:noHBand="0" w:noVBand="1"/>
       </w:tblPr>
       <w:tblGrid>
-        <w:gridCol w:w="4896"/>
-        <w:gridCol w:w="4896"/>
+        <w:gridCol w:w="4888"/>
+        <w:gridCol w:w="4888"/>
       </w:tblGrid>
       <w:tr>
         <w:trPr>
@@ -5996,9 +6255,9 @@
         <w:tblLook w:val="04A0" w:firstRow="1" w:lastRow="0" w:firstColumn="1" w:lastColumn="0" w:noHBand="0" w:noVBand="1"/>
       </w:tblPr>
       <w:tblGrid>
-        <w:gridCol w:w="3264"/>
-        <w:gridCol w:w="3264"/>
-        <w:gridCol w:w="3264"/>
+        <w:gridCol w:w="3258"/>
+        <w:gridCol w:w="3259"/>
+        <w:gridCol w:w="3259"/>
       </w:tblGrid>
       <w:tr>
         <w:trPr>
@@ -6499,7 +6758,7 @@
               <w:rPr>
                 <w:sz w:val="18"/>
               </w:rPr>
-              <w:t>Core analysis target is under 5 seconds for the agreed sample dataset on the development machine.</w:t>
+              <w:t>Core analysis target is under 5 seconds for the agreed sample dataset on the development machine; verify and record the measured runtime.</w:t>
             </w:r>
           </w:p>
         </w:tc>
@@ -6602,6 +6861,30 @@
         </w:tc>
       </w:tr>
     </w:tbl>
+    <w:p>
+      <w:pPr>
+        <w:pStyle w:val="Heading1"/>
+        <w:rPr>
+          <w:rFonts w:ascii="Times New Roman" w:hAnsi="Times New Roman" w:cs="Times New Roman"/>
+        </w:rPr>
+      </w:pPr>
+    </w:p>
+    <w:p>
+      <w:pPr>
+        <w:spacing w:after="0"/>
+      </w:pPr>
+    </w:p>
+    <w:p>
+      <w:pPr>
+        <w:pStyle w:val="Heading1"/>
+        <w:spacing w:before="0"/>
+        <w:rPr>
+          <w:rFonts w:ascii="Times New Roman" w:hAnsi="Times New Roman" w:cs="Times New Roman"/>
+        </w:rPr>
+      </w:pPr>
+    </w:p>
+    <w:p/>
+    <w:p/>
     <w:p>
       <w:pPr>
         <w:pStyle w:val="Heading1"/>
@@ -6613,6 +6896,7 @@
         <w:rPr>
           <w:rFonts w:ascii="Times New Roman" w:hAnsi="Times New Roman" w:cs="Times New Roman"/>
         </w:rPr>
+        <w:lastRenderedPageBreak/>
         <w:t>9. Decisions Requiring Approval</w:t>
       </w:r>
     </w:p>
@@ -6624,10 +6908,10 @@
         <w:tblLook w:val="04A0" w:firstRow="1" w:lastRow="0" w:firstColumn="1" w:lastColumn="0" w:noHBand="0" w:noVBand="1"/>
       </w:tblPr>
       <w:tblGrid>
-        <w:gridCol w:w="1811"/>
-        <w:gridCol w:w="1989"/>
-        <w:gridCol w:w="4141"/>
-        <w:gridCol w:w="2067"/>
+        <w:gridCol w:w="1805"/>
+        <w:gridCol w:w="1985"/>
+        <w:gridCol w:w="4036"/>
+        <w:gridCol w:w="1950"/>
       </w:tblGrid>
       <w:tr>
         <w:trPr>
@@ -6807,7 +7091,7 @@
               <w:rPr>
                 <w:sz w:val="18"/>
               </w:rPr>
-              <w:t>Approve the nine proposed fields and required/optional flags.</w:t>
+              <w:t>Use the nine fields and required/optional flags defined in this document and the Data Specification.</w:t>
             </w:r>
           </w:p>
         </w:tc>
@@ -6830,7 +7114,7 @@
               <w:rPr>
                 <w:sz w:val="18"/>
               </w:rPr>
-              <w:t>Pending</w:t>
+              <w:t>Resolved</w:t>
             </w:r>
           </w:p>
         </w:tc>
@@ -6904,7 +7188,7 @@
               <w:rPr>
                 <w:sz w:val="18"/>
               </w:rPr>
-              <w:t>Reject missing schema; skip and report individual invalid rows.</w:t>
+              <w:t>Reject empty/structurally invalid files or missing required headers; skip and report individual invalid rows.</w:t>
             </w:r>
           </w:p>
         </w:tc>
@@ -6927,7 +7211,7 @@
               <w:rPr>
                 <w:sz w:val="18"/>
               </w:rPr>
-              <w:t>Pending</w:t>
+              <w:t>Resolved</w:t>
             </w:r>
           </w:p>
         </w:tc>
@@ -7001,7 +7285,7 @@
               <w:rPr>
                 <w:sz w:val="18"/>
               </w:rPr>
-              <w:t>Approve DET-01 through DET-04 and the proposed threshold/window values.</w:t>
+              <w:t>Implement DET-01, DET-02, and DET-03 using the conditions in Section 4; DET-04 is deferred.</w:t>
             </w:r>
           </w:p>
         </w:tc>
@@ -7024,7 +7308,7 @@
               <w:rPr>
                 <w:sz w:val="18"/>
               </w:rPr>
-              <w:t>Pending</w:t>
+              <w:t>Resolved</w:t>
             </w:r>
           </w:p>
         </w:tc>
@@ -7098,7 +7382,7 @@
               <w:rPr>
                 <w:sz w:val="18"/>
               </w:rPr>
-              <w:t>Approve High/Medium mapping and decide whether to include a Low-severity rule.</w:t>
+              <w:t>DET-02 = High; DET-01 and DET-03 = Medium; High takes precedence; Low is reserved and not emitted in MVP.</w:t>
             </w:r>
           </w:p>
         </w:tc>
@@ -7121,7 +7405,7 @@
               <w:rPr>
                 <w:sz w:val="18"/>
               </w:rPr>
-              <w:t>Pending</w:t>
+              <w:t>Resolved</w:t>
             </w:r>
           </w:p>
         </w:tc>
@@ -7195,7 +7479,7 @@
               <w:rPr>
                 <w:sz w:val="18"/>
               </w:rPr>
-              <w:t>Use a dedicated synthetic indicator field instead of relying only on free-text details.</w:t>
+              <w:t>Defer DET-04 and any dedicated synthetic indicator field to a later version.</w:t>
             </w:r>
           </w:p>
         </w:tc>
@@ -7218,7 +7502,7 @@
               <w:rPr>
                 <w:sz w:val="18"/>
               </w:rPr>
-              <w:t>Recommended refinement</w:t>
+              <w:t>Deferred</w:t>
             </w:r>
           </w:p>
         </w:tc>
@@ -7292,7 +7576,21 @@
               <w:rPr>
                 <w:sz w:val="18"/>
               </w:rPr>
-              <w:t>Keep all new files under `03_Practical_Implementation_Project/SentinelLite/`.</w:t>
+              <w:t>Keep all new files under 03_Practical_Implementation_Project/</w:t>
+            </w:r>
+            <w:proofErr w:type="spellStart"/>
+            <w:r>
+              <w:rPr>
+                <w:sz w:val="18"/>
+              </w:rPr>
+              <w:t>SentinelLite</w:t>
+            </w:r>
+            <w:proofErr w:type="spellEnd"/>
+            <w:r>
+              <w:rPr>
+                <w:sz w:val="18"/>
+              </w:rPr>
+              <w:t>/.</w:t>
             </w:r>
           </w:p>
         </w:tc>
@@ -7315,7 +7613,7 @@
               <w:rPr>
                 <w:sz w:val="18"/>
               </w:rPr>
-              <w:t>Confirmed in proposal</w:t>
+              <w:t>Confirmed</w:t>
             </w:r>
           </w:p>
         </w:tc>
@@ -7338,7 +7636,7 @@
     </w:p>
     <w:p>
       <w:r>
-        <w:t>This document is a design proposal based on the approved Project Proposal and SRS. Items marked pending must be resolved before implementation. Any approved change to the schema, detection thresholds, severity mapping, or scope must be recorded in the decision log and reflected in tests.</w:t>
+        <w:t>This document records the agreed MVP design baseline. The schema, invalid-row policy, DET-01 to DET-03 conditions, severity mapping, and repository layout are defined here. DET-04 is deferred. Any later change must be recorded in the decision log and reflected in the data specification and tests.</w:t>
       </w:r>
     </w:p>
     <w:tbl>
@@ -7349,9 +7647,9 @@
         <w:tblLook w:val="04A0" w:firstRow="1" w:lastRow="0" w:firstColumn="1" w:lastColumn="0" w:noHBand="0" w:noVBand="1"/>
       </w:tblPr>
       <w:tblGrid>
-        <w:gridCol w:w="2418"/>
-        <w:gridCol w:w="2439"/>
-        <w:gridCol w:w="2424"/>
+        <w:gridCol w:w="2309"/>
+        <w:gridCol w:w="2405"/>
+        <w:gridCol w:w="2335"/>
         <w:gridCol w:w="2727"/>
       </w:tblGrid>
       <w:tr>
@@ -8547,6 +8845,7 @@
   <w:style w:type="character" w:default="1" w:styleId="DefaultParagraphFont">
     <w:name w:val="Default Paragraph Font"/>
     <w:uiPriority w:val="1"/>
+    <w:semiHidden/>
     <w:unhideWhenUsed/>
   </w:style>
   <w:style w:type="table" w:default="1" w:styleId="TableNormal">

</xml_diff>